<commit_message>
docs(entrega): documento sem tabelas de texto (equipe, modelo de dados e dicas em lista)
Troca as tabelas por texto e usa quebra de página no título da seção, sem página em branco.

Co-Authored-By: Claude Sonnet 5.5 <noreply@anthropic.com>
Claude-Session: https://claude.ai/code/session_018cp3cMGWmAt6UJucmbcae1
</commit_message>
<xml_diff>
--- a/docs/entrega/ProjetoG2_261023.docx
+++ b/docs/entrega/ProjetoG2_261023.docx
@@ -67,233 +67,65 @@
         <w:t>Nome da equipe / do aplicativo: EduMind</w:t>
       </w:r>
     </w:p>
-    <w:tbl>
-      <w:tblPr>
-        <w:tblStyle w:val="TableGrid"/>
-        <w:tblW w:type="auto" w:w="0"/>
-        <w:tblLook w:firstColumn="1" w:firstRow="1" w:lastColumn="0" w:lastRow="0" w:noHBand="0" w:noVBand="1" w:val="04A0"/>
-      </w:tblPr>
-      <w:tblGrid>
-        <w:gridCol w:w="3137"/>
-        <w:gridCol w:w="3137"/>
-        <w:gridCol w:w="3137"/>
-      </w:tblGrid>
-      <w:tr>
-        <w:tc>
-          <w:tcPr>
-            <w:tcW w:type="dxa" w:w="4252"/>
-            <w:shd w:val="clear" w:color="auto" w:fill="1B3A5F"/>
-          </w:tcPr>
-          <w:p>
-            <w:r>
-              <w:rPr>
-                <w:b/>
-                <w:color w:val="FFFFFF"/>
-                <w:sz w:val="19"/>
-              </w:rPr>
-              <w:t>Integrante</w:t>
-            </w:r>
-          </w:p>
-        </w:tc>
-        <w:tc>
-          <w:tcPr>
-            <w:tcW w:type="dxa" w:w="1701"/>
-            <w:shd w:val="clear" w:color="auto" w:fill="1B3A5F"/>
-          </w:tcPr>
-          <w:p>
-            <w:r>
-              <w:rPr>
-                <w:b/>
-                <w:color w:val="FFFFFF"/>
-                <w:sz w:val="19"/>
-              </w:rPr>
-              <w:t>Matrícula</w:t>
-            </w:r>
-          </w:p>
-        </w:tc>
-        <w:tc>
-          <w:tcPr>
-            <w:tcW w:type="dxa" w:w="3402"/>
-            <w:shd w:val="clear" w:color="auto" w:fill="1B3A5F"/>
-          </w:tcPr>
-          <w:p>
-            <w:r>
-              <w:rPr>
-                <w:b/>
-                <w:color w:val="FFFFFF"/>
-                <w:sz w:val="19"/>
-              </w:rPr>
-              <w:t>Observação</w:t>
-            </w:r>
-          </w:p>
-        </w:tc>
-      </w:tr>
-      <w:tr>
-        <w:tc>
-          <w:tcPr>
-            <w:tcW w:type="dxa" w:w="4252"/>
-          </w:tcPr>
-          <w:p>
-            <w:r>
-              <w:rPr>
-                <w:sz w:val="19"/>
-              </w:rPr>
-              <w:t>Gustavo Peixoto Siriacov</w:t>
-            </w:r>
-          </w:p>
-        </w:tc>
-        <w:tc>
-          <w:tcPr>
-            <w:tcW w:type="dxa" w:w="1701"/>
-          </w:tcPr>
-          <w:p>
-            <w:r>
-              <w:rPr>
-                <w:sz w:val="19"/>
-              </w:rPr>
-              <w:t>202411977</w:t>
-            </w:r>
-          </w:p>
-        </w:tc>
-        <w:tc>
-          <w:tcPr>
-            <w:tcW w:type="dxa" w:w="3402"/>
-          </w:tcPr>
-          <w:p>
-            <w:r>
-              <w:rPr>
-                <w:sz w:val="19"/>
-              </w:rPr>
-              <w:t>responsável pelo envio no LEX</w:t>
-            </w:r>
-          </w:p>
-        </w:tc>
-      </w:tr>
-      <w:tr>
-        <w:tc>
-          <w:tcPr>
-            <w:tcW w:type="dxa" w:w="4252"/>
-          </w:tcPr>
-          <w:p>
-            <w:r>
-              <w:rPr>
-                <w:sz w:val="19"/>
-              </w:rPr>
-              <w:t>Tales Ivaniski Galina</w:t>
-            </w:r>
-          </w:p>
-        </w:tc>
-        <w:tc>
-          <w:tcPr>
-            <w:tcW w:type="dxa" w:w="1701"/>
-          </w:tcPr>
-          <w:p>
-            <w:r>
-              <w:rPr>
-                <w:sz w:val="19"/>
-              </w:rPr>
-              <w:t>202510926</w:t>
-            </w:r>
-          </w:p>
-        </w:tc>
-        <w:tc>
-          <w:tcPr>
-            <w:tcW w:type="dxa" w:w="3402"/>
-          </w:tcPr>
-          <w:p>
-            <w:r>
-              <w:rPr>
-                <w:sz w:val="19"/>
-              </w:rPr>
-            </w:r>
-          </w:p>
-        </w:tc>
-      </w:tr>
-      <w:tr>
-        <w:tc>
-          <w:tcPr>
-            <w:tcW w:type="dxa" w:w="4252"/>
-          </w:tcPr>
-          <w:p>
-            <w:r>
-              <w:rPr>
-                <w:sz w:val="19"/>
-              </w:rPr>
-              <w:t>Lorenzo Ruggini Lindemann</w:t>
-            </w:r>
-          </w:p>
-        </w:tc>
-        <w:tc>
-          <w:tcPr>
-            <w:tcW w:type="dxa" w:w="1701"/>
-          </w:tcPr>
-          <w:p>
-            <w:r>
-              <w:rPr>
-                <w:sz w:val="19"/>
-              </w:rPr>
-              <w:t>202511046</w:t>
-            </w:r>
-          </w:p>
-        </w:tc>
-        <w:tc>
-          <w:tcPr>
-            <w:tcW w:type="dxa" w:w="3402"/>
-          </w:tcPr>
-          <w:p>
-            <w:r>
-              <w:rPr>
-                <w:sz w:val="19"/>
-              </w:rPr>
-            </w:r>
-          </w:p>
-        </w:tc>
-      </w:tr>
-      <w:tr>
-        <w:tc>
-          <w:tcPr>
-            <w:tcW w:type="dxa" w:w="4252"/>
-          </w:tcPr>
-          <w:p>
-            <w:r>
-              <w:rPr>
-                <w:sz w:val="19"/>
-              </w:rPr>
-              <w:t>Eduardo Cassel da Costa</w:t>
-            </w:r>
-          </w:p>
-        </w:tc>
-        <w:tc>
-          <w:tcPr>
-            <w:tcW w:type="dxa" w:w="1701"/>
-          </w:tcPr>
-          <w:p>
-            <w:r>
-              <w:rPr>
-                <w:sz w:val="19"/>
-              </w:rPr>
-              <w:t>202513138</w:t>
-            </w:r>
-          </w:p>
-        </w:tc>
-        <w:tc>
-          <w:tcPr>
-            <w:tcW w:type="dxa" w:w="3402"/>
-          </w:tcPr>
-          <w:p>
-            <w:r>
-              <w:rPr>
-                <w:sz w:val="19"/>
-              </w:rPr>
-            </w:r>
-          </w:p>
-        </w:tc>
-      </w:tr>
-    </w:tbl>
     <w:p>
       <w:pPr>
-        <w:spacing w:after="80"/>
+        <w:pStyle w:val="ListBullet"/>
+        <w:spacing w:after="40"/>
       </w:pPr>
+      <w:r>
+        <w:rPr>
+          <w:b/>
+        </w:rPr>
+        <w:t>Gustavo Peixoto Siriacov</w:t>
+      </w:r>
+      <w:r>
+        <w:t xml:space="preserve"> — matrícula 202411977 (responsável pelo envio no LEX)</w:t>
+      </w:r>
+    </w:p>
+    <w:p>
+      <w:pPr>
+        <w:pStyle w:val="ListBullet"/>
+        <w:spacing w:after="40"/>
+      </w:pPr>
+      <w:r>
+        <w:rPr>
+          <w:b/>
+        </w:rPr>
+        <w:t>Tales Ivaniski Galina</w:t>
+      </w:r>
+      <w:r>
+        <w:t xml:space="preserve"> — matrícula 202510926</w:t>
+      </w:r>
+    </w:p>
+    <w:p>
+      <w:pPr>
+        <w:pStyle w:val="ListBullet"/>
+        <w:spacing w:after="40"/>
+      </w:pPr>
+      <w:r>
+        <w:rPr>
+          <w:b/>
+        </w:rPr>
+        <w:t>Lorenzo Ruggini Lindemann</w:t>
+      </w:r>
+      <w:r>
+        <w:t xml:space="preserve"> — matrícula 202511046</w:t>
+      </w:r>
+    </w:p>
+    <w:p>
+      <w:pPr>
+        <w:pStyle w:val="ListBullet"/>
+        <w:spacing w:after="40"/>
+      </w:pPr>
+      <w:r>
+        <w:rPr>
+          <w:b/>
+        </w:rPr>
+        <w:t>Eduardo Cassel da Costa</w:t>
+      </w:r>
+      <w:r>
+        <w:t xml:space="preserve"> — matrícula 202513138</w:t>
+      </w:r>
     </w:p>
     <w:p>
       <w:pPr>
@@ -415,13 +247,9 @@
       </w:r>
     </w:p>
     <w:p>
-      <w:r>
-        <w:br w:type="page"/>
-      </w:r>
-    </w:p>
-    <w:p>
       <w:pPr>
         <w:pStyle w:val="Heading1"/>
+        <w:pageBreakBefore/>
       </w:pPr>
       <w:r>
         <w:t>3. Telas de acesso do usuário</w:t>
@@ -1080,13 +908,9 @@
       </w:pPr>
     </w:p>
     <w:p>
-      <w:r>
-        <w:br w:type="page"/>
-      </w:r>
-    </w:p>
-    <w:p>
       <w:pPr>
         <w:pStyle w:val="Heading1"/>
+        <w:pageBreakBefore/>
       </w:pPr>
       <w:r>
         <w:t>4. Modelo de dados do acesso e do log</w:t>
@@ -1158,195 +982,62 @@
         <w:t>Figura 2 — Diagrama entidade-relacionamento: usuários, sessões (uma por dispositivo) e log de acesso.</w:t>
       </w:r>
     </w:p>
-    <w:tbl>
-      <w:tblPr>
-        <w:tblStyle w:val="TableGrid"/>
-        <w:tblW w:type="auto" w:w="0"/>
-        <w:tblLook w:firstColumn="1" w:firstRow="1" w:lastColumn="0" w:lastRow="0" w:noHBand="0" w:noVBand="1" w:val="04A0"/>
-      </w:tblPr>
-      <w:tblGrid>
-        <w:gridCol w:w="3137"/>
-        <w:gridCol w:w="3137"/>
-        <w:gridCol w:w="3137"/>
-      </w:tblGrid>
-      <w:tr>
-        <w:tc>
-          <w:tcPr>
-            <w:tcW w:type="dxa" w:w="1474"/>
-            <w:shd w:val="clear" w:color="auto" w:fill="1B3A5F"/>
-          </w:tcPr>
-          <w:p>
-            <w:r>
-              <w:rPr>
-                <w:b/>
-                <w:color w:val="FFFFFF"/>
-                <w:sz w:val="19"/>
-              </w:rPr>
-              <w:t>Tabela</w:t>
-            </w:r>
-          </w:p>
-        </w:tc>
-        <w:tc>
-          <w:tcPr>
-            <w:tcW w:type="dxa" w:w="4082"/>
-            <w:shd w:val="clear" w:color="auto" w:fill="1B3A5F"/>
-          </w:tcPr>
-          <w:p>
-            <w:r>
-              <w:rPr>
-                <w:b/>
-                <w:color w:val="FFFFFF"/>
-                <w:sz w:val="19"/>
-              </w:rPr>
-              <w:t>Para que serve</w:t>
-            </w:r>
-          </w:p>
-        </w:tc>
-        <w:tc>
-          <w:tcPr>
-            <w:tcW w:type="dxa" w:w="4082"/>
-            <w:shd w:val="clear" w:color="auto" w:fill="1B3A5F"/>
-          </w:tcPr>
-          <w:p>
-            <w:r>
-              <w:rPr>
-                <w:b/>
-                <w:color w:val="FFFFFF"/>
-                <w:sz w:val="19"/>
-              </w:rPr>
-              <w:t>Pontos de atenção</w:t>
-            </w:r>
-          </w:p>
-        </w:tc>
-      </w:tr>
-      <w:tr>
-        <w:tc>
-          <w:tcPr>
-            <w:tcW w:type="dxa" w:w="1474"/>
-          </w:tcPr>
-          <w:p>
-            <w:r>
-              <w:rPr>
-                <w:sz w:val="19"/>
-              </w:rPr>
-              <w:t>users</w:t>
-            </w:r>
-          </w:p>
-        </w:tc>
-        <w:tc>
-          <w:tcPr>
-            <w:tcW w:type="dxa" w:w="4082"/>
-          </w:tcPr>
-          <w:p>
-            <w:r>
-              <w:rPr>
-                <w:sz w:val="19"/>
-              </w:rPr>
-              <w:t>Conta do estudante ou administrador (e-mail, nome, papel, ativo/bloqueado).</w:t>
-            </w:r>
-          </w:p>
-        </w:tc>
-        <w:tc>
-          <w:tcPr>
-            <w:tcW w:type="dxa" w:w="4082"/>
-          </w:tcPr>
-          <w:p>
-            <w:r>
-              <w:rPr>
-                <w:sz w:val="19"/>
-              </w:rPr>
-              <w:t>Senha guardada só como hash (scrypt). O papel define o acesso à área do administrador.</w:t>
-            </w:r>
-          </w:p>
-        </w:tc>
-      </w:tr>
-      <w:tr>
-        <w:tc>
-          <w:tcPr>
-            <w:tcW w:type="dxa" w:w="1474"/>
-          </w:tcPr>
-          <w:p>
-            <w:r>
-              <w:rPr>
-                <w:sz w:val="19"/>
-              </w:rPr>
-              <w:t>sessions</w:t>
-            </w:r>
-          </w:p>
-        </w:tc>
-        <w:tc>
-          <w:tcPr>
-            <w:tcW w:type="dxa" w:w="4082"/>
-          </w:tcPr>
-          <w:p>
-            <w:r>
-              <w:rPr>
-                <w:sz w:val="19"/>
-              </w:rPr>
-              <w:t>Um acesso aberto em um dispositivo (cookie de sessão, dispositivo, IP, validade de 7 dias).</w:t>
-            </w:r>
-          </w:p>
-        </w:tc>
-        <w:tc>
-          <w:tcPr>
-            <w:tcW w:type="dxa" w:w="4082"/>
-          </w:tcPr>
-          <w:p>
-            <w:r>
-              <w:rPr>
-                <w:sz w:val="19"/>
-              </w:rPr>
-              <w:t>Só o hash do token é guardado. Encerrar a sessão (logout, desconectar aparelho, bloqueio) preenche revoked_at.</w:t>
-            </w:r>
-          </w:p>
-        </w:tc>
-      </w:tr>
-      <w:tr>
-        <w:tc>
-          <w:tcPr>
-            <w:tcW w:type="dxa" w:w="1474"/>
-          </w:tcPr>
-          <w:p>
-            <w:r>
-              <w:rPr>
-                <w:sz w:val="19"/>
-              </w:rPr>
-              <w:t>access_logs</w:t>
-            </w:r>
-          </w:p>
-        </w:tc>
-        <w:tc>
-          <w:tcPr>
-            <w:tcW w:type="dxa" w:w="4082"/>
-          </w:tcPr>
-          <w:p>
-            <w:r>
-              <w:rPr>
-                <w:sz w:val="19"/>
-              </w:rPr>
-              <w:t>Histórico de acessos: nome, data e hora do login, hora do logout, dispositivo e motivo.</w:t>
-            </w:r>
-          </w:p>
-        </w:tc>
-        <w:tc>
-          <w:tcPr>
-            <w:tcW w:type="dxa" w:w="4082"/>
-          </w:tcPr>
-          <w:p>
-            <w:r>
-              <w:rPr>
-                <w:sz w:val="19"/>
-              </w:rPr>
-              <w:t>logout_at nulo = em andamento. Nome e e-mail são cópias: o log sobrevive à exclusão da conta.</w:t>
-            </w:r>
-          </w:p>
-        </w:tc>
-      </w:tr>
-    </w:tbl>
     <w:p>
       <w:pPr>
-        <w:spacing w:after="80"/>
+        <w:spacing w:after="40"/>
       </w:pPr>
+      <w:r>
+        <w:rPr>
+          <w:b/>
+          <w:i w:val="0"/>
+        </w:rPr>
+        <w:t>Tabelas do modelo</w:t>
+      </w:r>
+    </w:p>
+    <w:p>
+      <w:pPr>
+        <w:pStyle w:val="ListBullet"/>
+        <w:spacing w:after="40"/>
+      </w:pPr>
+      <w:r>
+        <w:rPr>
+          <w:b/>
+        </w:rPr>
+        <w:t xml:space="preserve">users: </w:t>
+      </w:r>
+      <w:r>
+        <w:t>conta do estudante ou administrador (e-mail, nome, papel, ativo ou bloqueado). A senha é guardada só como hash (scrypt) e o papel define o acesso à área do administrador.</w:t>
+      </w:r>
+    </w:p>
+    <w:p>
+      <w:pPr>
+        <w:pStyle w:val="ListBullet"/>
+        <w:spacing w:after="40"/>
+      </w:pPr>
+      <w:r>
+        <w:rPr>
+          <w:b/>
+        </w:rPr>
+        <w:t xml:space="preserve">sessions: </w:t>
+      </w:r>
+      <w:r>
+        <w:t>um acesso aberto em um dispositivo (cookie de sessão, dispositivo, IP, validade de 7 dias). Só o hash do token é guardado; encerrar a sessão (logout, desconectar aparelho ou bloqueio) preenche revoked_at.</w:t>
+      </w:r>
+    </w:p>
+    <w:p>
+      <w:pPr>
+        <w:pStyle w:val="ListBullet"/>
+        <w:spacing w:after="40"/>
+      </w:pPr>
+      <w:r>
+        <w:rPr>
+          <w:b/>
+        </w:rPr>
+        <w:t xml:space="preserve">access_logs: </w:t>
+      </w:r>
+      <w:r>
+        <w:t>histórico de acessos, com nome, data e hora do login, hora do logout, dispositivo e motivo. Quando logout_at é nulo, a sessão está em andamento. Nome e e-mail são cópias, então o log sobrevive à exclusão da conta.</w:t>
+      </w:r>
     </w:p>
     <w:p>
       <w:pPr>
@@ -1397,13 +1088,9 @@
       </w:r>
     </w:p>
     <w:p>
-      <w:r>
-        <w:br w:type="page"/>
-      </w:r>
-    </w:p>
-    <w:p>
       <w:pPr>
         <w:pStyle w:val="Heading1"/>
+        <w:pageBreakBefore/>
       </w:pPr>
       <w:r>
         <w:t>5. Fluxograma de acesso e registro do log</w:t>
@@ -1464,13 +1151,9 @@
       </w:r>
     </w:p>
     <w:p>
-      <w:r>
-        <w:br w:type="page"/>
-      </w:r>
-    </w:p>
-    <w:p>
       <w:pPr>
         <w:pStyle w:val="Heading1"/>
+        <w:pageBreakBefore/>
       </w:pPr>
       <w:r>
         <w:t>6. Área do administrador</w:t>
@@ -1657,13 +1340,9 @@
       </w:r>
     </w:p>
     <w:p>
-      <w:r>
-        <w:br w:type="page"/>
-      </w:r>
-    </w:p>
-    <w:p>
       <w:pPr>
         <w:pStyle w:val="Heading1"/>
+        <w:pageBreakBefore/>
       </w:pPr>
       <w:r>
         <w:t>7. Demais telas do protótipo (implementadas)</w:t>
@@ -1705,7 +1384,7 @@
             <w:r>
               <w:drawing>
                 <wp:inline xmlns:a="http://schemas.openxmlformats.org/drawingml/2006/main" xmlns:pic="http://schemas.openxmlformats.org/drawingml/2006/picture">
-                  <wp:extent cx="1404000" cy="3038400"/>
+                  <wp:extent cx="1260000" cy="2726769"/>
                   <wp:docPr id="13" name="Picture 13"/>
                   <wp:cNvGraphicFramePr>
                     <a:graphicFrameLocks noChangeAspect="1"/>
@@ -1726,7 +1405,7 @@
                         <pic:spPr>
                           <a:xfrm>
                             <a:off x="0" y="0"/>
-                            <a:ext cx="1404000" cy="3038400"/>
+                            <a:ext cx="1260000" cy="2726769"/>
                           </a:xfrm>
                           <a:prstGeom prst="rect"/>
                         </pic:spPr>
@@ -1749,7 +1428,7 @@
             <w:r>
               <w:drawing>
                 <wp:inline xmlns:a="http://schemas.openxmlformats.org/drawingml/2006/main" xmlns:pic="http://schemas.openxmlformats.org/drawingml/2006/picture">
-                  <wp:extent cx="1404000" cy="3038400"/>
+                  <wp:extent cx="1260000" cy="2726769"/>
                   <wp:docPr id="14" name="Picture 14"/>
                   <wp:cNvGraphicFramePr>
                     <a:graphicFrameLocks noChangeAspect="1"/>
@@ -1770,7 +1449,7 @@
                         <pic:spPr>
                           <a:xfrm>
                             <a:off x="0" y="0"/>
-                            <a:ext cx="1404000" cy="3038400"/>
+                            <a:ext cx="1260000" cy="2726769"/>
                           </a:xfrm>
                           <a:prstGeom prst="rect"/>
                         </pic:spPr>
@@ -1793,7 +1472,7 @@
             <w:r>
               <w:drawing>
                 <wp:inline xmlns:a="http://schemas.openxmlformats.org/drawingml/2006/main" xmlns:pic="http://schemas.openxmlformats.org/drawingml/2006/picture">
-                  <wp:extent cx="1404000" cy="3038400"/>
+                  <wp:extent cx="1260000" cy="2726769"/>
                   <wp:docPr id="15" name="Picture 15"/>
                   <wp:cNvGraphicFramePr>
                     <a:graphicFrameLocks noChangeAspect="1"/>
@@ -1814,7 +1493,7 @@
                         <pic:spPr>
                           <a:xfrm>
                             <a:off x="0" y="0"/>
-                            <a:ext cx="1404000" cy="3038400"/>
+                            <a:ext cx="1260000" cy="2726769"/>
                           </a:xfrm>
                           <a:prstGeom prst="rect"/>
                         </pic:spPr>
@@ -1911,7 +1590,7 @@
             <w:r>
               <w:drawing>
                 <wp:inline xmlns:a="http://schemas.openxmlformats.org/drawingml/2006/main" xmlns:pic="http://schemas.openxmlformats.org/drawingml/2006/picture">
-                  <wp:extent cx="2520000" cy="1575000"/>
+                  <wp:extent cx="2304000" cy="1440000"/>
                   <wp:docPr id="16" name="Picture 16"/>
                   <wp:cNvGraphicFramePr>
                     <a:graphicFrameLocks noChangeAspect="1"/>
@@ -1932,7 +1611,7 @@
                         <pic:spPr>
                           <a:xfrm>
                             <a:off x="0" y="0"/>
-                            <a:ext cx="2520000" cy="1575000"/>
+                            <a:ext cx="2304000" cy="1440000"/>
                           </a:xfrm>
                           <a:prstGeom prst="rect"/>
                         </pic:spPr>
@@ -1955,7 +1634,7 @@
             <w:r>
               <w:drawing>
                 <wp:inline xmlns:a="http://schemas.openxmlformats.org/drawingml/2006/main" xmlns:pic="http://schemas.openxmlformats.org/drawingml/2006/picture">
-                  <wp:extent cx="2520000" cy="1575000"/>
+                  <wp:extent cx="2304000" cy="1440000"/>
                   <wp:docPr id="17" name="Picture 17"/>
                   <wp:cNvGraphicFramePr>
                     <a:graphicFrameLocks noChangeAspect="1"/>
@@ -1976,7 +1655,7 @@
                         <pic:spPr>
                           <a:xfrm>
                             <a:off x="0" y="0"/>
-                            <a:ext cx="2520000" cy="1575000"/>
+                            <a:ext cx="2304000" cy="1440000"/>
                           </a:xfrm>
                           <a:prstGeom prst="rect"/>
                         </pic:spPr>
@@ -2041,195 +1720,80 @@
         <w:t>8. Dicas de tela da aula aplicadas</w:t>
       </w:r>
     </w:p>
-    <w:tbl>
-      <w:tblPr>
-        <w:tblStyle w:val="TableGrid"/>
-        <w:tblW w:type="auto" w:w="0"/>
-        <w:tblLook w:firstColumn="1" w:firstRow="1" w:lastColumn="0" w:lastRow="0" w:noHBand="0" w:noVBand="1" w:val="04A0"/>
-      </w:tblPr>
-      <w:tblGrid>
-        <w:gridCol w:w="4706"/>
-        <w:gridCol w:w="4706"/>
-      </w:tblGrid>
-      <w:tr>
-        <w:tc>
-          <w:tcPr>
-            <w:tcW w:type="dxa" w:w="3685"/>
-            <w:shd w:val="clear" w:color="auto" w:fill="1B3A5F"/>
-          </w:tcPr>
-          <w:p>
-            <w:r>
-              <w:rPr>
-                <w:b/>
-                <w:color w:val="FFFFFF"/>
-                <w:sz w:val="19"/>
-              </w:rPr>
-              <w:t>Dica</w:t>
-            </w:r>
-          </w:p>
-        </w:tc>
-        <w:tc>
-          <w:tcPr>
-            <w:tcW w:type="dxa" w:w="5953"/>
-            <w:shd w:val="clear" w:color="auto" w:fill="1B3A5F"/>
-          </w:tcPr>
-          <w:p>
-            <w:r>
-              <w:rPr>
-                <w:b/>
-                <w:color w:val="FFFFFF"/>
-                <w:sz w:val="19"/>
-              </w:rPr>
-              <w:t>Como foi aplicada</w:t>
-            </w:r>
-          </w:p>
-        </w:tc>
-      </w:tr>
-      <w:tr>
-        <w:tc>
-          <w:tcPr>
-            <w:tcW w:type="dxa" w:w="3685"/>
-          </w:tcPr>
-          <w:p>
-            <w:r>
-              <w:rPr>
-                <w:sz w:val="19"/>
-              </w:rPr>
-              <w:t>Telas com muitos recursos confundem no celular</w:t>
-            </w:r>
-          </w:p>
-        </w:tc>
-        <w:tc>
-          <w:tcPr>
-            <w:tcW w:type="dxa" w:w="5953"/>
-          </w:tcPr>
-          <w:p>
-            <w:r>
-              <w:rPr>
-                <w:sz w:val="19"/>
-              </w:rPr>
-              <w:t>Uma tarefa por tela e no máximo 5 destinos na navegação inferior.</w:t>
-            </w:r>
-          </w:p>
-        </w:tc>
-      </w:tr>
-      <w:tr>
-        <w:tc>
-          <w:tcPr>
-            <w:tcW w:type="dxa" w:w="3685"/>
-          </w:tcPr>
-          <w:p>
-            <w:r>
-              <w:rPr>
-                <w:sz w:val="19"/>
-              </w:rPr>
-              <w:t>Interface minimalista com chamadas para outras telas</w:t>
-            </w:r>
-          </w:p>
-        </w:tc>
-        <w:tc>
-          <w:tcPr>
-            <w:tcW w:type="dxa" w:w="5953"/>
-          </w:tcPr>
-          <w:p>
-            <w:r>
-              <w:rPr>
-                <w:sz w:val="19"/>
-              </w:rPr>
-              <w:t>Cartões que levam ao detalhe; ações secundárias em menus e modais.</w:t>
-            </w:r>
-          </w:p>
-        </w:tc>
-      </w:tr>
-      <w:tr>
-        <w:tc>
-          <w:tcPr>
-            <w:tcW w:type="dxa" w:w="3685"/>
-          </w:tcPr>
-          <w:p>
-            <w:r>
-              <w:rPr>
-                <w:sz w:val="19"/>
-              </w:rPr>
-              <w:t>Telas que precisam de ajuda/treinamento</w:t>
-            </w:r>
-          </w:p>
-        </w:tc>
-        <w:tc>
-          <w:tcPr>
-            <w:tcW w:type="dxa" w:w="5953"/>
-          </w:tcPr>
-          <w:p>
-            <w:r>
-              <w:rPr>
-                <w:sz w:val="19"/>
-              </w:rPr>
-              <w:t>Apresentação inicial de 3 passos e botão “?” em todas as telas.</w:t>
-            </w:r>
-          </w:p>
-        </w:tc>
-      </w:tr>
-      <w:tr>
-        <w:tc>
-          <w:tcPr>
-            <w:tcW w:type="dxa" w:w="3685"/>
-          </w:tcPr>
-          <w:p>
-            <w:r>
-              <w:rPr>
-                <w:sz w:val="19"/>
-              </w:rPr>
-              <w:t>Símbolos já consagrados</w:t>
-            </w:r>
-          </w:p>
-        </w:tc>
-        <w:tc>
-          <w:tcPr>
-            <w:tcW w:type="dxa" w:w="5953"/>
-          </w:tcPr>
-          <w:p>
-            <w:r>
-              <w:rPr>
-                <w:sz w:val="19"/>
-              </w:rPr>
-              <w:t>Ícones padrão: lixeira para excluir, lápis para editar, olho para mostrar a senha, seta para enviar.</w:t>
-            </w:r>
-          </w:p>
-        </w:tc>
-      </w:tr>
-      <w:tr>
-        <w:tc>
-          <w:tcPr>
-            <w:tcW w:type="dxa" w:w="3685"/>
-          </w:tcPr>
-          <w:p>
-            <w:r>
-              <w:rPr>
-                <w:sz w:val="19"/>
-              </w:rPr>
-              <w:t>Informação rápida e completa</w:t>
-            </w:r>
-          </w:p>
-        </w:tc>
-        <w:tc>
-          <w:tcPr>
-            <w:tcW w:type="dxa" w:w="5953"/>
-          </w:tcPr>
-          <w:p>
-            <w:r>
-              <w:rPr>
-                <w:sz w:val="19"/>
-              </w:rPr>
-              <w:t>A tela Início reúne as metas do dia, o progresso por disciplina e as próximas aulas.</w:t>
-            </w:r>
-          </w:p>
-        </w:tc>
-      </w:tr>
-    </w:tbl>
     <w:p>
       <w:pPr>
-        <w:spacing w:after="0" w:before="0" w:lineRule="exact" w:line="20"/>
+        <w:pStyle w:val="ListBullet"/>
+        <w:spacing w:after="40"/>
       </w:pPr>
+      <w:r>
+        <w:rPr>
+          <w:b/>
+        </w:rPr>
+        <w:t xml:space="preserve">Telas com muitos recursos confundem no celular: </w:t>
+      </w:r>
+      <w:r>
+        <w:t>uma tarefa por tela e no máximo 5 destinos na navegação inferior.</w:t>
+      </w:r>
+    </w:p>
+    <w:p>
+      <w:pPr>
+        <w:pStyle w:val="ListBullet"/>
+        <w:spacing w:after="40"/>
+      </w:pPr>
+      <w:r>
+        <w:rPr>
+          <w:b/>
+        </w:rPr>
+        <w:t xml:space="preserve">Interface minimalista com chamadas para outras telas: </w:t>
+      </w:r>
+      <w:r>
+        <w:t>cartões que levam ao detalhe; ações secundárias em menus e modais.</w:t>
+      </w:r>
+    </w:p>
+    <w:p>
+      <w:pPr>
+        <w:pStyle w:val="ListBullet"/>
+        <w:spacing w:after="40"/>
+      </w:pPr>
+      <w:r>
+        <w:rPr>
+          <w:b/>
+        </w:rPr>
+        <w:t xml:space="preserve">Telas que precisam de ajuda ou treinamento: </w:t>
+      </w:r>
+      <w:r>
+        <w:t>apresentação inicial de 3 passos e botão “?” em todas as telas.</w:t>
+      </w:r>
+    </w:p>
+    <w:p>
+      <w:pPr>
+        <w:pStyle w:val="ListBullet"/>
+        <w:spacing w:after="40"/>
+      </w:pPr>
+      <w:r>
+        <w:rPr>
+          <w:b/>
+        </w:rPr>
+        <w:t xml:space="preserve">Símbolos já consagrados: </w:t>
+      </w:r>
+      <w:r>
+        <w:t>ícones padrão, como lixeira para excluir, lápis para editar, olho para mostrar a senha e seta para enviar.</w:t>
+      </w:r>
+    </w:p>
+    <w:p>
+      <w:pPr>
+        <w:pStyle w:val="ListBullet"/>
+        <w:spacing w:after="40"/>
+      </w:pPr>
+      <w:r>
+        <w:rPr>
+          <w:b/>
+        </w:rPr>
+        <w:t xml:space="preserve">Informação rápida e completa: </w:t>
+      </w:r>
+      <w:r>
+        <w:t>a tela Início reúne as metas do dia, o progresso por disciplina e as próximas aulas.</w:t>
+      </w:r>
     </w:p>
     <w:sectPr>
       <w:pgSz w:w="11906" w:h="16838"/>

</xml_diff>